<commit_message>
Revisión final: diagramas legibles en páginas horizontales y ajustes de redacción
Co-Authored-By: Claude Opus 5.5 <noreply@anthropic.com>
Claude-Session: https://claude.ai/code/session_01VaFUiBXVf6BB5GUu9UqiGZ
</commit_message>
<xml_diff>
--- a/Actividad_3_SouthWest/Actividad_3_SouthWest_Airlines_Inteligencia_de_Negocios.docx
+++ b/Actividad_3_SouthWest/Actividad_3_SouthWest_Airlines_Inteligencia_de_Negocios.docx
@@ -249,7 +249,7 @@
         <w:pStyle w:val="APASEPTIMA"/>
       </w:pPr>
       <w:r>
-        <w:t>Southwest Airlines es la aerolínea de bajo costo más grande del mundo por número de pasajeros y ha tenido ganancias todos los años desde 1973. Sin embargo, su crecimiento dejó atrás a sus sistemas heredados, que guardaban los datos del inventario de piezas pero no los hacían visibles para quienes debían tomar decisiones. Para resolverlo, la empresa implementó tres módulos de administración de la cadena de suministro (SCM) de i2 Technologies, con los que redujo en un 15 % su inventario de piezas, ahorró más de 30 millones de dólares y subió su nivel de servicio del 92 % a más del 95 %.</w:t>
+        <w:t>Southwest Airlines es la aerolínea de tarifas bajas más grande del mundo y ha tenido ganancias todos los años desde 1973. Sin embargo, su crecimiento dejó atrás a sus sistemas heredados, que guardaban los datos del inventario de piezas pero no los hacían visibles para quienes debían tomar decisiones. Para resolverlo, la empresa implementó tres módulos de administración de la cadena de suministro (SCM) de i2 Technologies, con los que redujo en un 15 % su inventario de piezas, ahorró más de 30 millones de dólares y subió su nivel de servicio del 92 % a más del 95 %.</w:t>
       </w:r>
     </w:p>
     <w:p>
@@ -448,6 +448,14 @@
     <w:p>
       <w:pPr>
         <w:pStyle w:val="APASEPTIMA"/>
+        <w:sectPr>
+          <w:footerReference w:type="default" r:id="rId9"/>
+          <w:headerReference w:type="default" r:id="rId12"/>
+          <w:pgSz w:w="12240" w:h="15840"/>
+          <w:pgMar w:top="1440" w:right="1440" w:bottom="1440" w:left="1440" w:header="709" w:footer="709" w:gutter="0"/>
+          <w:cols w:space="708"/>
+          <w:docGrid w:linePitch="360"/>
+        </w:sectPr>
       </w:pPr>
       <w:r>
         <w:t>Un sistema ERP integra en una sola base de datos central los procesos de finanzas, compras, recursos humanos, producción y mantenimiento, de modo que todas las áreas trabajan con la misma información (Laudon y Laudon, 2012). Un sistema SCM, en cambio, se enfoca en planificar y coordinar el flujo de materiales entre proveedores, almacenes y puntos de uso. En Southwest, los módulos de i2 resuelven la planificación (qué piezas tener, cuántas y dónde), pero no registran las transacciones del día a día. Ese papel lo cumpliría un ERP, como se representa en la Figura 1.</w:t>
@@ -456,6 +464,7 @@
     <w:p>
       <w:pPr>
         <w:pStyle w:val="APASEPTIMA"/>
+        <w:keepNext/>
         <w:ind w:firstLine="0"/>
       </w:pPr>
       <w:r>
@@ -468,6 +477,7 @@
     <w:p>
       <w:pPr>
         <w:pStyle w:val="APASEPTIMA"/>
+        <w:keepNext/>
         <w:ind w:firstLine="0"/>
       </w:pPr>
       <w:r>
@@ -483,11 +493,12 @@
         <w:keepNext/>
         <w:spacing w:line="240" w:lineRule="auto"/>
         <w:ind w:firstLine="0"/>
+        <w:jc w:val="center"/>
       </w:pPr>
       <w:r>
         <w:drawing>
           <wp:inline xmlns:a="http://schemas.openxmlformats.org/drawingml/2006/main" xmlns:pic="http://schemas.openxmlformats.org/drawingml/2006/picture">
-            <wp:extent cx="5760720" cy="3417376"/>
+            <wp:extent cx="7498079" cy="4575099"/>
             <wp:docPr id="1584518222" name="Picture 1584518222"/>
             <wp:cNvGraphicFramePr>
               <a:graphicFrameLocks noChangeAspect="1"/>
@@ -508,7 +519,7 @@
                   <pic:spPr>
                     <a:xfrm>
                       <a:off x="0" y="0"/>
-                      <a:ext cx="5760720" cy="3417376"/>
+                      <a:ext cx="7498079" cy="4575099"/>
                     </a:xfrm>
                     <a:prstGeom prst="rect"/>
                   </pic:spPr>
@@ -523,6 +534,14 @@
       <w:pPr>
         <w:pStyle w:val="APASEPTIMA"/>
         <w:ind w:firstLine="0"/>
+        <w:sectPr>
+          <w:footerReference w:type="default" r:id="rId9"/>
+          <w:headerReference w:type="default" r:id="rId12"/>
+          <w:pgSz w:w="15840" w:h="12240" w:orient="landscape"/>
+          <w:pgMar w:top="1440" w:right="1440" w:bottom="1440" w:left="1440" w:header="709" w:footer="709" w:gutter="0"/>
+          <w:cols w:space="708"/>
+          <w:docGrid w:linePitch="360"/>
+        </w:sectPr>
       </w:pPr>
       <w:r>
         <w:rPr>
@@ -715,12 +734,20 @@
         <w:t>sistema de soporte de decisiones (DSS)</w:t>
       </w:r>
       <w:r>
-        <w:t>. Un DSS combina datos con modelos analíticos para ayudar a los gerentes a tomar decisiones semiestructuradas, como el ejemplo visto en clase del sistema de soporte de decisiones para la estimación de viajes (Laudon y Laudon, 2012). En Southwest este papel lo cumple i2 Service Budget Optimizer, que permite cambiar un supuesto, como el nivel de servicio, y ver cuánto cuesta.</w:t>
-      </w:r>
-    </w:p>
-    <w:p>
-      <w:pPr>
-        <w:pStyle w:val="APASEPTIMA"/>
+        <w:t>. Un DSS combina datos con modelos analíticos para ayudar a los gerentes a tomar decisiones semiestructuradas, como el ejemplo visto en clase del sistema de soporte de decisiones para la estimación de viajes (Laudon y Laudon, 2012). En Southwest este papel lo cumplen las herramientas de i2, en especial i2 Service Budget Optimizer, que permiten cambiar un supuesto, como el nivel de servicio, y ver cuánto cuesta.</w:t>
+      </w:r>
+    </w:p>
+    <w:p>
+      <w:pPr>
+        <w:pStyle w:val="APASEPTIMA"/>
+        <w:sectPr>
+          <w:footerReference w:type="default" r:id="rId9"/>
+          <w:headerReference w:type="default" r:id="rId12"/>
+          <w:pgSz w:w="12240" w:h="15840"/>
+          <w:pgMar w:top="1440" w:right="1440" w:bottom="1440" w:left="1440" w:header="709" w:footer="709" w:gutter="0"/>
+          <w:cols w:space="708"/>
+          <w:docGrid w:linePitch="360"/>
+        </w:sectPr>
       </w:pPr>
       <w:r>
         <w:t>Los datos se estructuran en dos niveles. En el nivel transaccional se guardan en una base de datos relacional diseñada con el modelo entidad-relación. La Figura 2 muestra ese modelo para el caso, siguiendo los pasos vistos en clase: identificar entidades, definir atributos, establecer relaciones y asignar cardinalidades.</w:t>
@@ -729,6 +756,7 @@
     <w:p>
       <w:pPr>
         <w:pStyle w:val="APASEPTIMA"/>
+        <w:keepNext/>
         <w:ind w:firstLine="0"/>
       </w:pPr>
       <w:r>
@@ -741,6 +769,7 @@
     <w:p>
       <w:pPr>
         <w:pStyle w:val="APASEPTIMA"/>
+        <w:keepNext/>
         <w:ind w:firstLine="0"/>
       </w:pPr>
       <w:r>
@@ -756,11 +785,12 @@
         <w:keepNext/>
         <w:spacing w:line="240" w:lineRule="auto"/>
         <w:ind w:firstLine="0"/>
+        <w:jc w:val="center"/>
       </w:pPr>
       <w:r>
         <w:drawing>
           <wp:inline xmlns:a="http://schemas.openxmlformats.org/drawingml/2006/main" xmlns:pic="http://schemas.openxmlformats.org/drawingml/2006/picture">
-            <wp:extent cx="5943600" cy="3423213"/>
+            <wp:extent cx="7863840" cy="4403208"/>
             <wp:docPr id="1584518223" name="Picture 1584518223"/>
             <wp:cNvGraphicFramePr>
               <a:graphicFrameLocks noChangeAspect="1"/>
@@ -781,7 +811,7 @@
                   <pic:spPr>
                     <a:xfrm>
                       <a:off x="0" y="0"/>
-                      <a:ext cx="5943600" cy="3423213"/>
+                      <a:ext cx="7863840" cy="4403208"/>
                     </a:xfrm>
                     <a:prstGeom prst="rect"/>
                   </pic:spPr>
@@ -796,6 +826,14 @@
       <w:pPr>
         <w:pStyle w:val="APASEPTIMA"/>
         <w:ind w:firstLine="0"/>
+        <w:sectPr>
+          <w:footerReference w:type="default" r:id="rId9"/>
+          <w:headerReference w:type="default" r:id="rId12"/>
+          <w:pgSz w:w="15840" w:h="12240" w:orient="landscape"/>
+          <w:pgMar w:top="1440" w:right="1440" w:bottom="1440" w:left="1440" w:header="709" w:footer="709" w:gutter="0"/>
+          <w:cols w:space="708"/>
+          <w:docGrid w:linePitch="360"/>
+        </w:sectPr>
       </w:pPr>
       <w:r>
         <w:rPr>

</xml_diff>

<commit_message>
Segunda revisión: coherencia en preguntas 1 y 7, concordancia y limpieza del correo en el archivo
Co-Authored-By: Claude Opus 5.5 <noreply@anthropic.com>
Claude-Session: https://claude.ai/code/session_01VaFUiBXVf6BB5GUu9UqiGZ
</commit_message>
<xml_diff>
--- a/Actividad_3_SouthWest/Actividad_3_SouthWest_Airlines_Inteligencia_de_Negocios.docx
+++ b/Actividad_3_SouthWest/Actividad_3_SouthWest_Airlines_Inteligencia_de_Negocios.docx
@@ -286,7 +286,7 @@
         <w:pStyle w:val="APASEPTIMA"/>
       </w:pPr>
       <w:r>
-        <w:t>Un sistema heredado es un sistema de procesamiento de transacciones (TPS) antiguo que la empresa sigue usando porque reemplazarlo es costoso y riesgoso (Laudon y Laudon, 2012). Si se analiza con las funciones de un sistema de información (entrada, procesamiento, salida y retroalimentación), los sistemas de Southwest cumplían con la entrada y el almacenamiento, pero fallaban en la salida: los datos existían, pero no llegaban a los gerentes a tiempo ni en una forma útil. Por eso el problema del caso es la falta de visibilidad y no la falta de datos.</w:t>
+        <w:t>Un sistema heredado es un sistema de procesamiento de transacciones (TPS) antiguo que la empresa sigue usando porque reemplazarlo es costoso y riesgoso (Laudon y Laudon, 2012). Si se analiza con las funciones de un sistema de información (entrada, procesamiento, salida y retroalimentación), los sistemas de Southwest cumplían con la entrada y el procesamiento, pero fallaban en la salida: los datos existían, pero no llegaban a los gerentes a tiempo ni en una forma útil. Por eso el problema del caso es la falta de visibilidad y no la falta de datos.</w:t>
       </w:r>
     </w:p>
     <w:p>
@@ -317,7 +317,7 @@
         <w:t>Incompatibilidad de los datos.</w:t>
       </w:r>
       <w:r>
-        <w:t xml:space="preserve"> Los sistemas heredados suelen manejar formatos, códigos de pieza y estructuras distintas a las de la nueva plataforma. Antes de conectarlos hay que limpiar, estandarizar y eliminar duplicados, porque un pronóstico hecho con datos errados produce decisiones erradas.</w:t>
+        <w:t xml:space="preserve"> Los sistemas heredados suelen manejar formatos, códigos de pieza y estructuras distintos a los de la nueva plataforma. Antes de conectarlos hay que limpiar, estandarizar y eliminar duplicados, porque un pronóstico hecho con datos errados produce decisiones erradas.</w:t>
       </w:r>
     </w:p>
     <w:p>
@@ -1066,7 +1066,7 @@
         <w:t>Escalabilidad.</w:t>
       </w:r>
       <w:r>
-        <w:t xml:space="preserve"> Fue la principal falla de los sistemas heredados. El nuevo sistema debe soportar el crecimiento en aeronaves, ciudades y volumen de datos.</w:t>
+        <w:t xml:space="preserve"> Los sistemas heredados no pudieron mantenerse a la par con la cantidad creciente de datos. El nuevo sistema debe soportar el crecimiento en aeronaves, ciudades y volumen de datos.</w:t>
       </w:r>
     </w:p>
     <w:p>

</xml_diff>

<commit_message>
Revisión de diagramas: clave compuesta en VUELO y flujo SCM-proveedores coherente con el texto
Co-Authored-By: Claude Opus 5.5 <noreply@anthropic.com>
Claude-Session: https://claude.ai/code/session_01VaFUiBXVf6BB5GUu9UqiGZ
</commit_message>
<xml_diff>
--- a/Actividad_3_SouthWest/Actividad_3_SouthWest_Airlines_Inteligencia_de_Negocios.docx
+++ b/Actividad_3_SouthWest/Actividad_3_SouthWest_Airlines_Inteligencia_de_Negocios.docx
@@ -842,15 +842,15 @@
         <w:t xml:space="preserve">Nota. </w:t>
       </w:r>
       <w:r>
-        <w:t>Elaboración propia en draw.io. Los atributos subrayados son las claves primarias.</w:t>
-      </w:r>
-    </w:p>
-    <w:p>
-      <w:pPr>
-        <w:pStyle w:val="APASEPTIMA"/>
-      </w:pPr>
-      <w:r>
-        <w:t>En el modelo, un PROVEEDOR suministra varias PIEZAS (1:N). Una PIEZA se almacena en varias UBICACIONES y una ubicación guarda muchas piezas; esta relación tiene sus propios atributos, stock actual y stock mínimo, que son justamente las combinaciones de pieza y ubicación que pronostica i2. Una ORDEN DE MANTENIMIENTO consume piezas con una cantidad, lo que construye el historial de consumo. Cada AERONAVE recibe varias órdenes de mantenimiento y opera varios VUELOS, cuyo estado permite medir los retrasos y cancelaciones.</w:t>
+        <w:t>Elaboración propia en draw.io. Los atributos subrayados son las claves primarias. La cardinalidad junto a cada entidad indica el mínimo y el máximo de ocurrencias con que participa en la relación.</w:t>
+      </w:r>
+    </w:p>
+    <w:p>
+      <w:pPr>
+        <w:pStyle w:val="APASEPTIMA"/>
+      </w:pPr>
+      <w:r>
+        <w:t>En el modelo, un PROVEEDOR suministra varias PIEZAS (1:N). Una PIEZA se almacena en varias UBICACIONES y una ubicación guarda muchas piezas; esta relación tiene sus propios atributos, stock actual y stock mínimo, que son justamente las combinaciones de pieza y ubicación que pronostica i2. Una ORDEN DE MANTENIMIENTO consume piezas con una cantidad, lo que construye el historial de consumo. Cada AERONAVE puede recibir varias órdenes de mantenimiento (0:N) y opera varios VUELOS (1:N), cuyo estado permite medir los retrasos y cancelaciones. En VUELO la clave es compuesta (número de vuelo y fecha), porque el mismo número de vuelo se repite todos los días.</w:t>
       </w:r>
     </w:p>
     <w:p>

</xml_diff>